<commit_message>
Insert 10 figure placeholders (box + caption + source link) into coursework version
Each placeholder is anchored at the relevant point in the text, adds an
in-text (Fig. N) callout, and carries a caption naming the source figure in
a cited paper plus a download link, so the user can drop in the real figure.
Open-access (CC BY) sources are flagged; copyrighted ones link to the
publisher. De-duplication ensures each figure is inserted once. No
copyrighted artwork is embedded. Removed the earlier self-drawn figures per
user preference.
</commit_message>
<xml_diff>
--- a/review_coursework.docx
+++ b/review_coursework.docx
@@ -702,7 +702,82 @@
           <w:b w:val="0"/>
           <w:i w:val="0"/>
         </w:rPr>
-        <w:t xml:space="preserve"> (~60%) were anthropogenic [7].</w:t>
+        <w:t xml:space="preserve"> (~60%) were anthropogenic [7] (Fig. 3).</w:t>
+      </w:r>
+    </w:p>
+    <w:tbl>
+      <w:tblPr>
+        <w:tblW w:type="auto" w:w="0"/>
+        <w:jc w:val="center"/>
+        <w:tblLook w:firstColumn="1" w:firstRow="1" w:lastColumn="0" w:lastRow="0" w:noHBand="0" w:noVBand="1" w:val="04A0"/>
+      </w:tblPr>
+      <w:tblGrid>
+        <w:gridCol w:w="8640"/>
+      </w:tblGrid>
+      <w:tr>
+        <w:tc>
+          <w:tcPr>
+            <w:tcW w:type="dxa" w:w="8640"/>
+            <w:tcBorders>
+              <w:top w:val="single" w:sz="8" w:space="0" w:color="999999"/>
+              <w:left w:val="single" w:sz="8" w:space="0" w:color="999999"/>
+              <w:bottom w:val="single" w:sz="8" w:space="0" w:color="999999"/>
+              <w:right w:val="single" w:sz="8" w:space="0" w:color="999999"/>
+            </w:tcBorders>
+          </w:tcPr>
+          <w:p>
+            <w:pPr>
+              <w:spacing w:line="240" w:lineRule="auto" w:before="920" w:after="920"/>
+              <w:jc w:val="center"/>
+            </w:pPr>
+            <w:r>
+              <w:rPr>
+                <w:i/>
+                <w:color w:val="888888"/>
+                <w:sz w:val="20"/>
+              </w:rPr>
+              <w:t>[ Fig. 3 — paste figure here ]</w:t>
+            </w:r>
+          </w:p>
+        </w:tc>
+      </w:tr>
+    </w:tbl>
+    <w:p>
+      <w:pPr>
+        <w:spacing w:before="40" w:after="200" w:line="240" w:lineRule="auto"/>
+        <w:jc w:val="both"/>
+      </w:pPr>
+      <w:r>
+        <w:rPr>
+          <w:b/>
+          <w:i w:val="0"/>
+          <w:sz w:val="19"/>
+        </w:rPr>
+        <w:t xml:space="preserve">Fig. 3. </w:t>
+      </w:r>
+      <w:r>
+        <w:rPr>
+          <w:b w:val="0"/>
+          <w:i w:val="0"/>
+          <w:sz w:val="19"/>
+        </w:rPr>
+        <w:t xml:space="preserve">The global methane budget: natural and anthropogenic CH4 sources and the principal sinks. </w:t>
+      </w:r>
+      <w:r>
+        <w:rPr>
+          <w:b w:val="0"/>
+          <w:i/>
+          <w:sz w:val="19"/>
+        </w:rPr>
+        <w:t>Source: Saunois et al., The Global Methane Budget 2000-2017, Earth Syst. Sci. Data, 2020, 12: 1561 [7] (open access, CC BY 4.0).</w:t>
+      </w:r>
+      <w:r>
+        <w:rPr>
+          <w:b w:val="0"/>
+          <w:i w:val="0"/>
+          <w:sz w:val="19"/>
+        </w:rPr>
+        <w:t xml:space="preserve">  Download: https://essd.copernicus.org/articles/12/1561/2020/</w:t>
       </w:r>
     </w:p>
     <w:p>
@@ -1043,7 +1118,82 @@
           <w:b w:val="0"/>
           <w:i w:val="0"/>
         </w:rPr>
-        <w:t>) [13]. Because secondary organic aerosol is a major fraction of submicron organic mass yet carries large uncertainty in its direct and indirect forcing, it remains a leading research challenge for quantifying aerosol–climate coupling [14].</w:t>
+        <w:t>) [13]. Because secondary organic aerosol is a major fraction of submicron organic mass yet carries large uncertainty in its direct and indirect forcing, it remains a leading research challenge for quantifying aerosol–climate coupling [14] (Fig. 2).</w:t>
+      </w:r>
+    </w:p>
+    <w:tbl>
+      <w:tblPr>
+        <w:tblW w:type="auto" w:w="0"/>
+        <w:jc w:val="center"/>
+        <w:tblLook w:firstColumn="1" w:firstRow="1" w:lastColumn="0" w:lastRow="0" w:noHBand="0" w:noVBand="1" w:val="04A0"/>
+      </w:tblPr>
+      <w:tblGrid>
+        <w:gridCol w:w="8640"/>
+      </w:tblGrid>
+      <w:tr>
+        <w:tc>
+          <w:tcPr>
+            <w:tcW w:type="dxa" w:w="8640"/>
+            <w:tcBorders>
+              <w:top w:val="single" w:sz="8" w:space="0" w:color="999999"/>
+              <w:left w:val="single" w:sz="8" w:space="0" w:color="999999"/>
+              <w:bottom w:val="single" w:sz="8" w:space="0" w:color="999999"/>
+              <w:right w:val="single" w:sz="8" w:space="0" w:color="999999"/>
+            </w:tcBorders>
+          </w:tcPr>
+          <w:p>
+            <w:pPr>
+              <w:spacing w:line="240" w:lineRule="auto" w:before="920" w:after="920"/>
+              <w:jc w:val="center"/>
+            </w:pPr>
+            <w:r>
+              <w:rPr>
+                <w:i/>
+                <w:color w:val="888888"/>
+                <w:sz w:val="20"/>
+              </w:rPr>
+              <w:t>[ Fig. 2 — paste figure here ]</w:t>
+            </w:r>
+          </w:p>
+        </w:tc>
+      </w:tr>
+    </w:tbl>
+    <w:p>
+      <w:pPr>
+        <w:spacing w:before="40" w:after="200" w:line="240" w:lineRule="auto"/>
+        <w:jc w:val="both"/>
+      </w:pPr>
+      <w:r>
+        <w:rPr>
+          <w:b/>
+          <w:i w:val="0"/>
+          <w:sz w:val="19"/>
+        </w:rPr>
+        <w:t xml:space="preserve">Fig. 2. </w:t>
+      </w:r>
+      <w:r>
+        <w:rPr>
+          <w:b w:val="0"/>
+          <w:i w:val="0"/>
+          <w:sz w:val="19"/>
+        </w:rPr>
+        <w:t xml:space="preserve">Effective radiative forcing of the climate system by component over 1750-2019. </w:t>
+      </w:r>
+      <w:r>
+        <w:rPr>
+          <w:b w:val="0"/>
+          <w:i/>
+          <w:sz w:val="19"/>
+        </w:rPr>
+        <w:t>Source: IPCC AR6 WGI, Chapter 7, Fig. 7.6 (Forster et al.) [5].</w:t>
+      </w:r>
+      <w:r>
+        <w:rPr>
+          <w:b w:val="0"/>
+          <w:i w:val="0"/>
+          <w:sz w:val="19"/>
+        </w:rPr>
+        <w:t xml:space="preserve">  Download: https://www.ipcc.ch/report/ar6/wg1/figures/chapter-7/figure-7-6/</w:t>
       </w:r>
     </w:p>
     <w:p>
@@ -1263,7 +1413,82 @@
           <w:b w:val="0"/>
           <w:i w:val="0"/>
         </w:rPr>
-        <w:t>, progressively weakening the chemical buffering and the efficiency of the solubility pump as the century proceeds [18].</w:t>
+        <w:t>, progressively weakening the chemical buffering and the efficiency of the solubility pump as the century proceeds [18] (Fig. 4).</w:t>
+      </w:r>
+    </w:p>
+    <w:tbl>
+      <w:tblPr>
+        <w:tblW w:type="auto" w:w="0"/>
+        <w:jc w:val="center"/>
+        <w:tblLook w:firstColumn="1" w:firstRow="1" w:lastColumn="0" w:lastRow="0" w:noHBand="0" w:noVBand="1" w:val="04A0"/>
+      </w:tblPr>
+      <w:tblGrid>
+        <w:gridCol w:w="8640"/>
+      </w:tblGrid>
+      <w:tr>
+        <w:tc>
+          <w:tcPr>
+            <w:tcW w:type="dxa" w:w="8640"/>
+            <w:tcBorders>
+              <w:top w:val="single" w:sz="8" w:space="0" w:color="999999"/>
+              <w:left w:val="single" w:sz="8" w:space="0" w:color="999999"/>
+              <w:bottom w:val="single" w:sz="8" w:space="0" w:color="999999"/>
+              <w:right w:val="single" w:sz="8" w:space="0" w:color="999999"/>
+            </w:tcBorders>
+          </w:tcPr>
+          <w:p>
+            <w:pPr>
+              <w:spacing w:line="240" w:lineRule="auto" w:before="920" w:after="920"/>
+              <w:jc w:val="center"/>
+            </w:pPr>
+            <w:r>
+              <w:rPr>
+                <w:i/>
+                <w:color w:val="888888"/>
+                <w:sz w:val="20"/>
+              </w:rPr>
+              <w:t>[ Fig. 4 — paste figure here ]</w:t>
+            </w:r>
+          </w:p>
+        </w:tc>
+      </w:tr>
+    </w:tbl>
+    <w:p>
+      <w:pPr>
+        <w:spacing w:before="40" w:after="200" w:line="240" w:lineRule="auto"/>
+        <w:jc w:val="both"/>
+      </w:pPr>
+      <w:r>
+        <w:rPr>
+          <w:b/>
+          <w:i w:val="0"/>
+          <w:sz w:val="19"/>
+        </w:rPr>
+        <w:t xml:space="preserve">Fig. 4. </w:t>
+      </w:r>
+      <w:r>
+        <w:rPr>
+          <w:b w:val="0"/>
+          <w:i w:val="0"/>
+          <w:sz w:val="19"/>
+        </w:rPr>
+        <w:t xml:space="preserve">Change in the column inventory of anthropogenic carbon stored in the ocean. </w:t>
+      </w:r>
+      <w:r>
+        <w:rPr>
+          <w:b w:val="0"/>
+          <w:i/>
+          <w:sz w:val="19"/>
+        </w:rPr>
+        <w:t>Source: Gruber et al., Science, 2019, 363: 1193 [17] (copyright AAAS; access via publisher/institution).</w:t>
+      </w:r>
+      <w:r>
+        <w:rPr>
+          <w:b w:val="0"/>
+          <w:i w:val="0"/>
+          <w:sz w:val="19"/>
+        </w:rPr>
+        <w:t xml:space="preserve">  Download: https://www.science.org/doi/10.1126/science.aau5153</w:t>
       </w:r>
     </w:p>
     <w:p>
@@ -1391,7 +1616,82 @@
           <w:b w:val="0"/>
           <w:i w:val="0"/>
         </w:rPr>
-        <w:t xml:space="preserve"> rose to as much as 39%, accompanied by extensive shell malformation and dissolution [21].</w:t>
+        <w:t xml:space="preserve"> rose to as much as 39%, accompanied by extensive shell malformation and dissolution [21] (Fig. 5).</w:t>
+      </w:r>
+    </w:p>
+    <w:tbl>
+      <w:tblPr>
+        <w:tblW w:type="auto" w:w="0"/>
+        <w:jc w:val="center"/>
+        <w:tblLook w:firstColumn="1" w:firstRow="1" w:lastColumn="0" w:lastRow="0" w:noHBand="0" w:noVBand="1" w:val="04A0"/>
+      </w:tblPr>
+      <w:tblGrid>
+        <w:gridCol w:w="8640"/>
+      </w:tblGrid>
+      <w:tr>
+        <w:tc>
+          <w:tcPr>
+            <w:tcW w:type="dxa" w:w="8640"/>
+            <w:tcBorders>
+              <w:top w:val="single" w:sz="8" w:space="0" w:color="999999"/>
+              <w:left w:val="single" w:sz="8" w:space="0" w:color="999999"/>
+              <w:bottom w:val="single" w:sz="8" w:space="0" w:color="999999"/>
+              <w:right w:val="single" w:sz="8" w:space="0" w:color="999999"/>
+            </w:tcBorders>
+          </w:tcPr>
+          <w:p>
+            <w:pPr>
+              <w:spacing w:line="240" w:lineRule="auto" w:before="920" w:after="920"/>
+              <w:jc w:val="center"/>
+            </w:pPr>
+            <w:r>
+              <w:rPr>
+                <w:i/>
+                <w:color w:val="888888"/>
+                <w:sz w:val="20"/>
+              </w:rPr>
+              <w:t>[ Fig. 5 — paste figure here ]</w:t>
+            </w:r>
+          </w:p>
+        </w:tc>
+      </w:tr>
+    </w:tbl>
+    <w:p>
+      <w:pPr>
+        <w:spacing w:before="40" w:after="200" w:line="240" w:lineRule="auto"/>
+        <w:jc w:val="both"/>
+      </w:pPr>
+      <w:r>
+        <w:rPr>
+          <w:b/>
+          <w:i w:val="0"/>
+          <w:sz w:val="19"/>
+        </w:rPr>
+        <w:t xml:space="preserve">Fig. 5. </w:t>
+      </w:r>
+      <w:r>
+        <w:rPr>
+          <w:b w:val="0"/>
+          <w:i w:val="0"/>
+          <w:sz w:val="19"/>
+        </w:rPr>
+        <w:t xml:space="preserve">Ocean acidification: decline in surface-ocean pH and shoaling of the aragonite saturation horizon. </w:t>
+      </w:r>
+      <w:r>
+        <w:rPr>
+          <w:b w:val="0"/>
+          <w:i/>
+          <w:sz w:val="19"/>
+        </w:rPr>
+        <w:t>Source: IPCC AR6 WGI, Chapter 5, Fig. 5.21 (Canadell et al.) [6].</w:t>
+      </w:r>
+      <w:r>
+        <w:rPr>
+          <w:b w:val="0"/>
+          <w:i w:val="0"/>
+          <w:sz w:val="19"/>
+        </w:rPr>
+        <w:t xml:space="preserve">  Download: https://www.ipcc.ch/report/ar6/wg1/figures/chapter-5/figure-5-21/</w:t>
       </w:r>
     </w:p>
     <w:p>
@@ -1519,7 +1819,82 @@
           <w:b w:val="0"/>
           <w:i w:val="0"/>
         </w:rPr>
-        <w:t>, the anoxic volume has approximately quadrupled, and more than 500 coastal low-oxygen sites are now documented; a further 3–4% global decline is projected by 2100 [23]. Multi-model projections show that twenty-first-century surface warming and pH decline are accompanied by substantial subsurface oxygen and productivity declines, with the largest oxygen and pH decreases in intermediate and mode waters [24]. Deoxygenation is itself chemically consequential because low-oxygen waters are the principal sites of nitrous-oxide production and of nitrogen loss through denitrification.</w:t>
+        <w:t>, the anoxic volume has approximately quadrupled, and more than 500 coastal low-oxygen sites are now documented; a further 3–4% global decline is projected by 2100 [23]. Multi-model projections show that twenty-first-century surface warming and pH decline are accompanied by substantial subsurface oxygen and productivity declines, with the largest oxygen and pH decreases in intermediate and mode waters [24]. Deoxygenation is itself chemically consequential because low-oxygen waters are the principal sites of nitrous-oxide production and of nitrogen loss through denitrification (Fig. 6).</w:t>
+      </w:r>
+    </w:p>
+    <w:tbl>
+      <w:tblPr>
+        <w:tblW w:type="auto" w:w="0"/>
+        <w:jc w:val="center"/>
+        <w:tblLook w:firstColumn="1" w:firstRow="1" w:lastColumn="0" w:lastRow="0" w:noHBand="0" w:noVBand="1" w:val="04A0"/>
+      </w:tblPr>
+      <w:tblGrid>
+        <w:gridCol w:w="8640"/>
+      </w:tblGrid>
+      <w:tr>
+        <w:tc>
+          <w:tcPr>
+            <w:tcW w:type="dxa" w:w="8640"/>
+            <w:tcBorders>
+              <w:top w:val="single" w:sz="8" w:space="0" w:color="999999"/>
+              <w:left w:val="single" w:sz="8" w:space="0" w:color="999999"/>
+              <w:bottom w:val="single" w:sz="8" w:space="0" w:color="999999"/>
+              <w:right w:val="single" w:sz="8" w:space="0" w:color="999999"/>
+            </w:tcBorders>
+          </w:tcPr>
+          <w:p>
+            <w:pPr>
+              <w:spacing w:line="240" w:lineRule="auto" w:before="920" w:after="920"/>
+              <w:jc w:val="center"/>
+            </w:pPr>
+            <w:r>
+              <w:rPr>
+                <w:i/>
+                <w:color w:val="888888"/>
+                <w:sz w:val="20"/>
+              </w:rPr>
+              <w:t>[ Fig. 6 — paste figure here ]</w:t>
+            </w:r>
+          </w:p>
+        </w:tc>
+      </w:tr>
+    </w:tbl>
+    <w:p>
+      <w:pPr>
+        <w:spacing w:before="40" w:after="200" w:line="240" w:lineRule="auto"/>
+        <w:jc w:val="both"/>
+      </w:pPr>
+      <w:r>
+        <w:rPr>
+          <w:b/>
+          <w:i w:val="0"/>
+          <w:sz w:val="19"/>
+        </w:rPr>
+        <w:t xml:space="preserve">Fig. 6. </w:t>
+      </w:r>
+      <w:r>
+        <w:rPr>
+          <w:b w:val="0"/>
+          <w:i w:val="0"/>
+          <w:sz w:val="19"/>
+        </w:rPr>
+        <w:t xml:space="preserve">Global distribution of declining dissolved oxygen in the open ocean and coastal waters. </w:t>
+      </w:r>
+      <w:r>
+        <w:rPr>
+          <w:b w:val="0"/>
+          <w:i/>
+          <w:sz w:val="19"/>
+        </w:rPr>
+        <w:t>Source: Breitburg et al., Science, 2018, 359: eaam7240 [23] (copyright AAAS; access via publisher/institution).</w:t>
+      </w:r>
+      <w:r>
+        <w:rPr>
+          <w:b w:val="0"/>
+          <w:i w:val="0"/>
+          <w:sz w:val="19"/>
+        </w:rPr>
+        <w:t xml:space="preserve">  Download: https://www.science.org/doi/10.1126/science.aam7240</w:t>
       </w:r>
     </w:p>
     <w:p>
@@ -1989,7 +2364,82 @@
           <w:b w:val="0"/>
           <w:i w:val="0"/>
         </w:rPr>
-        <w:t xml:space="preserve"> years (reassessed at roughly 240,000 years), which is why it cannot buffer anthropogenic emissions on human timescales [34].</w:t>
+        <w:t xml:space="preserve"> years (reassessed at roughly 240,000 years), which is why it cannot buffer anthropogenic emissions on human timescales [34] (Fig. 7).</w:t>
+      </w:r>
+    </w:p>
+    <w:tbl>
+      <w:tblPr>
+        <w:tblW w:type="auto" w:w="0"/>
+        <w:jc w:val="center"/>
+        <w:tblLook w:firstColumn="1" w:firstRow="1" w:lastColumn="0" w:lastRow="0" w:noHBand="0" w:noVBand="1" w:val="04A0"/>
+      </w:tblPr>
+      <w:tblGrid>
+        <w:gridCol w:w="8640"/>
+      </w:tblGrid>
+      <w:tr>
+        <w:tc>
+          <w:tcPr>
+            <w:tcW w:type="dxa" w:w="8640"/>
+            <w:tcBorders>
+              <w:top w:val="single" w:sz="8" w:space="0" w:color="999999"/>
+              <w:left w:val="single" w:sz="8" w:space="0" w:color="999999"/>
+              <w:bottom w:val="single" w:sz="8" w:space="0" w:color="999999"/>
+              <w:right w:val="single" w:sz="8" w:space="0" w:color="999999"/>
+            </w:tcBorders>
+          </w:tcPr>
+          <w:p>
+            <w:pPr>
+              <w:spacing w:line="240" w:lineRule="auto" w:before="920" w:after="920"/>
+              <w:jc w:val="center"/>
+            </w:pPr>
+            <w:r>
+              <w:rPr>
+                <w:i/>
+                <w:color w:val="888888"/>
+                <w:sz w:val="20"/>
+              </w:rPr>
+              <w:t>[ Fig. 7 — paste figure here ]</w:t>
+            </w:r>
+          </w:p>
+        </w:tc>
+      </w:tr>
+    </w:tbl>
+    <w:p>
+      <w:pPr>
+        <w:spacing w:before="40" w:after="200" w:line="240" w:lineRule="auto"/>
+        <w:jc w:val="both"/>
+      </w:pPr>
+      <w:r>
+        <w:rPr>
+          <w:b/>
+          <w:i w:val="0"/>
+          <w:sz w:val="19"/>
+        </w:rPr>
+        <w:t xml:space="preserve">Fig. 7. </w:t>
+      </w:r>
+      <w:r>
+        <w:rPr>
+          <w:b w:val="0"/>
+          <w:i w:val="0"/>
+          <w:sz w:val="19"/>
+        </w:rPr>
+        <w:t xml:space="preserve">The carbonate-silicate cycle and the silicate-weathering negative feedback (the long-term carbon thermostat). </w:t>
+      </w:r>
+      <w:r>
+        <w:rPr>
+          <w:b w:val="0"/>
+          <w:i/>
+          <w:sz w:val="19"/>
+        </w:rPr>
+        <w:t>Source: Penman et al., Earth-Sci. Rev., 2020, 209: 103298 [33] (copyright Elsevier; access via publisher/institution).</w:t>
+      </w:r>
+      <w:r>
+        <w:rPr>
+          <w:b w:val="0"/>
+          <w:i w:val="0"/>
+          <w:sz w:val="19"/>
+        </w:rPr>
+        <w:t xml:space="preserve">  Download: https://doi.org/10.1016/j.earscirev.2020.103298</w:t>
       </w:r>
     </w:p>
     <w:p>
@@ -2550,7 +3000,82 @@
           <w:b w:val="0"/>
           <w:i w:val="0"/>
         </w:rPr>
-        <w:t xml:space="preserve"> and methane by 2100, constituting a positive climate feedback [46]. The most likely mode of release is gradual and sustained over decades to centuries rather than an abrupt "bomb," but it is nonetheless large enough to erode the remaining carbon budget consistent with the Paris Agreement temperature targets [47].</w:t>
+        <w:t xml:space="preserve"> and methane by 2100, constituting a positive climate feedback [46]. The most likely mode of release is gradual and sustained over decades to centuries rather than an abrupt "bomb," but it is nonetheless large enough to erode the remaining carbon budget consistent with the Paris Agreement temperature targets [47] (Fig. 8).</w:t>
+      </w:r>
+    </w:p>
+    <w:tbl>
+      <w:tblPr>
+        <w:tblW w:type="auto" w:w="0"/>
+        <w:jc w:val="center"/>
+        <w:tblLook w:firstColumn="1" w:firstRow="1" w:lastColumn="0" w:lastRow="0" w:noHBand="0" w:noVBand="1" w:val="04A0"/>
+      </w:tblPr>
+      <w:tblGrid>
+        <w:gridCol w:w="8640"/>
+      </w:tblGrid>
+      <w:tr>
+        <w:tc>
+          <w:tcPr>
+            <w:tcW w:type="dxa" w:w="8640"/>
+            <w:tcBorders>
+              <w:top w:val="single" w:sz="8" w:space="0" w:color="999999"/>
+              <w:left w:val="single" w:sz="8" w:space="0" w:color="999999"/>
+              <w:bottom w:val="single" w:sz="8" w:space="0" w:color="999999"/>
+              <w:right w:val="single" w:sz="8" w:space="0" w:color="999999"/>
+            </w:tcBorders>
+          </w:tcPr>
+          <w:p>
+            <w:pPr>
+              <w:spacing w:line="240" w:lineRule="auto" w:before="920" w:after="920"/>
+              <w:jc w:val="center"/>
+            </w:pPr>
+            <w:r>
+              <w:rPr>
+                <w:i/>
+                <w:color w:val="888888"/>
+                <w:sz w:val="20"/>
+              </w:rPr>
+              <w:t>[ Fig. 8 — paste figure here ]</w:t>
+            </w:r>
+          </w:p>
+        </w:tc>
+      </w:tr>
+    </w:tbl>
+    <w:p>
+      <w:pPr>
+        <w:spacing w:before="40" w:after="200" w:line="240" w:lineRule="auto"/>
+        <w:jc w:val="both"/>
+      </w:pPr>
+      <w:r>
+        <w:rPr>
+          <w:b/>
+          <w:i w:val="0"/>
+          <w:sz w:val="19"/>
+        </w:rPr>
+        <w:t xml:space="preserve">Fig. 8. </w:t>
+      </w:r>
+      <w:r>
+        <w:rPr>
+          <w:b w:val="0"/>
+          <w:i w:val="0"/>
+          <w:sz w:val="19"/>
+        </w:rPr>
+        <w:t xml:space="preserve">Permafrost-zone carbon stocks and the permafrost carbon-climate feedback. </w:t>
+      </w:r>
+      <w:r>
+        <w:rPr>
+          <w:b w:val="0"/>
+          <w:i/>
+          <w:sz w:val="19"/>
+        </w:rPr>
+        <w:t>Source: Schuur et al., Nature, 2015, 520: 171 [46] (copyright Springer Nature; access via publisher/institution).</w:t>
+      </w:r>
+      <w:r>
+        <w:rPr>
+          <w:b w:val="0"/>
+          <w:i w:val="0"/>
+          <w:sz w:val="19"/>
+        </w:rPr>
+        <w:t xml:space="preserve">  Download: https://www.nature.com/articles/nature14338</w:t>
       </w:r>
     </w:p>
     <w:p>
@@ -2843,7 +3368,82 @@
           <w:b w:val="0"/>
           <w:i w:val="0"/>
         </w:rPr>
-        <w:t>, its weakest since 2003, driven largely by a decline of the tropical-land sink under drought and heat [48]. Such episodes are direct, observable manifestations of the carbon–climate feedback discussed in Section 6, and they illustrate how the atmospheric burden is governed not only by emissions but by the climate sensitivity of the land and ocean reservoirs.</w:t>
+        <w:t>, its weakest since 2003, driven largely by a decline of the tropical-land sink under drought and heat [48]. Such episodes are direct, observable manifestations of the carbon–climate feedback discussed in Section 6, and they illustrate how the atmospheric burden is governed not only by emissions but by the climate sensitivity of the land and ocean reservoirs (Fig. 1).</w:t>
+      </w:r>
+    </w:p>
+    <w:tbl>
+      <w:tblPr>
+        <w:tblW w:type="auto" w:w="0"/>
+        <w:jc w:val="center"/>
+        <w:tblLook w:firstColumn="1" w:firstRow="1" w:lastColumn="0" w:lastRow="0" w:noHBand="0" w:noVBand="1" w:val="04A0"/>
+      </w:tblPr>
+      <w:tblGrid>
+        <w:gridCol w:w="8640"/>
+      </w:tblGrid>
+      <w:tr>
+        <w:tc>
+          <w:tcPr>
+            <w:tcW w:type="dxa" w:w="8640"/>
+            <w:tcBorders>
+              <w:top w:val="single" w:sz="8" w:space="0" w:color="999999"/>
+              <w:left w:val="single" w:sz="8" w:space="0" w:color="999999"/>
+              <w:bottom w:val="single" w:sz="8" w:space="0" w:color="999999"/>
+              <w:right w:val="single" w:sz="8" w:space="0" w:color="999999"/>
+            </w:tcBorders>
+          </w:tcPr>
+          <w:p>
+            <w:pPr>
+              <w:spacing w:line="240" w:lineRule="auto" w:before="920" w:after="920"/>
+              <w:jc w:val="center"/>
+            </w:pPr>
+            <w:r>
+              <w:rPr>
+                <w:i/>
+                <w:color w:val="888888"/>
+                <w:sz w:val="20"/>
+              </w:rPr>
+              <w:t>[ Fig. 1 — paste figure here ]</w:t>
+            </w:r>
+          </w:p>
+        </w:tc>
+      </w:tr>
+    </w:tbl>
+    <w:p>
+      <w:pPr>
+        <w:spacing w:before="40" w:after="200" w:line="240" w:lineRule="auto"/>
+        <w:jc w:val="both"/>
+      </w:pPr>
+      <w:r>
+        <w:rPr>
+          <w:b/>
+          <w:i w:val="0"/>
+          <w:sz w:val="19"/>
+        </w:rPr>
+        <w:t xml:space="preserve">Fig. 1. </w:t>
+      </w:r>
+      <w:r>
+        <w:rPr>
+          <w:b w:val="0"/>
+          <w:i w:val="0"/>
+          <w:sz w:val="19"/>
+        </w:rPr>
+        <w:t xml:space="preserve">Global carbon budget: anthropogenic CO2 sources and their partitioning among atmospheric growth, the ocean sink and the land sink. </w:t>
+      </w:r>
+      <w:r>
+        <w:rPr>
+          <w:b w:val="0"/>
+          <w:i/>
+          <w:sz w:val="19"/>
+        </w:rPr>
+        <w:t>Source: Friedlingstein et al., Global Carbon Budget 2024, Earth Syst. Sci. Data, 2025, 17: 965 [2] (open access, CC BY 4.0).</w:t>
+      </w:r>
+      <w:r>
+        <w:rPr>
+          <w:b w:val="0"/>
+          <w:i w:val="0"/>
+          <w:sz w:val="19"/>
+        </w:rPr>
+        <w:t xml:space="preserve">  Download: https://essd.copernicus.org/articles/17/965/2025/</w:t>
       </w:r>
     </w:p>
     <w:p>
@@ -3514,7 +4114,82 @@
           <w:b w:val="0"/>
           <w:i w:val="0"/>
         </w:rPr>
-        <w:t xml:space="preserve"> (range −1.81 to −0.51)—stabilizing overall, yet permitting the assessed equilibrium climate sensitivity of 3 °C (likely 2.5–4 °C) and transient climate response of 1.8 °C [5], [1].</w:t>
+        <w:t xml:space="preserve"> (range −1.81 to −0.51)—stabilizing overall, yet permitting the assessed equilibrium climate sensitivity of 3 °C (likely 2.5–4 °C) and transient climate response of 1.8 °C [5], [1] (Fig. 9).</w:t>
+      </w:r>
+    </w:p>
+    <w:tbl>
+      <w:tblPr>
+        <w:tblW w:type="auto" w:w="0"/>
+        <w:jc w:val="center"/>
+        <w:tblLook w:firstColumn="1" w:firstRow="1" w:lastColumn="0" w:lastRow="0" w:noHBand="0" w:noVBand="1" w:val="04A0"/>
+      </w:tblPr>
+      <w:tblGrid>
+        <w:gridCol w:w="8640"/>
+      </w:tblGrid>
+      <w:tr>
+        <w:tc>
+          <w:tcPr>
+            <w:tcW w:type="dxa" w:w="8640"/>
+            <w:tcBorders>
+              <w:top w:val="single" w:sz="8" w:space="0" w:color="999999"/>
+              <w:left w:val="single" w:sz="8" w:space="0" w:color="999999"/>
+              <w:bottom w:val="single" w:sz="8" w:space="0" w:color="999999"/>
+              <w:right w:val="single" w:sz="8" w:space="0" w:color="999999"/>
+            </w:tcBorders>
+          </w:tcPr>
+          <w:p>
+            <w:pPr>
+              <w:spacing w:line="240" w:lineRule="auto" w:before="920" w:after="920"/>
+              <w:jc w:val="center"/>
+            </w:pPr>
+            <w:r>
+              <w:rPr>
+                <w:i/>
+                <w:color w:val="888888"/>
+                <w:sz w:val="20"/>
+              </w:rPr>
+              <w:t>[ Fig. 9 — paste figure here ]</w:t>
+            </w:r>
+          </w:p>
+        </w:tc>
+      </w:tr>
+    </w:tbl>
+    <w:p>
+      <w:pPr>
+        <w:spacing w:before="40" w:after="200" w:line="240" w:lineRule="auto"/>
+        <w:jc w:val="both"/>
+      </w:pPr>
+      <w:r>
+        <w:rPr>
+          <w:b/>
+          <w:i w:val="0"/>
+          <w:sz w:val="19"/>
+        </w:rPr>
+        <w:t xml:space="preserve">Fig. 9. </w:t>
+      </w:r>
+      <w:r>
+        <w:rPr>
+          <w:b w:val="0"/>
+          <w:i w:val="0"/>
+          <w:sz w:val="19"/>
+        </w:rPr>
+        <w:t xml:space="preserve">Individual climate feedback parameters assessed by IPCC AR6. </w:t>
+      </w:r>
+      <w:r>
+        <w:rPr>
+          <w:b w:val="0"/>
+          <w:i/>
+          <w:sz w:val="19"/>
+        </w:rPr>
+        <w:t>Source: IPCC AR6 WGI, Chapter 7, Fig. 7.10 (Forster et al.) [5].</w:t>
+      </w:r>
+      <w:r>
+        <w:rPr>
+          <w:b w:val="0"/>
+          <w:i w:val="0"/>
+          <w:sz w:val="19"/>
+        </w:rPr>
+        <w:t xml:space="preserve">  Download: https://www.ipcc.ch/report/ar6/wg1/figures/chapter-7/figure-7-10/</w:t>
       </w:r>
     </w:p>
     <w:p>
@@ -4018,7 +4693,82 @@
           <w:b w:val="0"/>
           <w:i w:val="0"/>
         </w:rPr>
-        <w:t xml:space="preserve"> with medium confidence [64]. In sharp contrast, an early-warning-signal analysis of observation-based AMOC fingerprints estimates a collapse central year of ~2057 (95% confidence interval 2025–2095), illustrating genuine and unresolved scientific disagreement about tipping timing [66]. Reassuringly, marine and terrestrial methane-hydrate dissociation is very unlikely to cause a detectable departure from emission trajectories this century, and IPCC AR6 does not include marine clathrates among its plausible near-term tipping points [29], [64].</w:t>
+        <w:t xml:space="preserve"> with medium confidence [64]. In sharp contrast, an early-warning-signal analysis of observation-based AMOC fingerprints estimates a collapse central year of ~2057 (95% confidence interval 2025–2095), illustrating genuine and unresolved scientific disagreement about tipping timing [66]. Reassuringly, marine and terrestrial methane-hydrate dissociation is very unlikely to cause a detectable departure from emission trajectories this century, and IPCC AR6 does not include marine clathrates among its plausible near-term tipping points [29], [64] (Fig. 10).</w:t>
+      </w:r>
+    </w:p>
+    <w:tbl>
+      <w:tblPr>
+        <w:tblW w:type="auto" w:w="0"/>
+        <w:jc w:val="center"/>
+        <w:tblLook w:firstColumn="1" w:firstRow="1" w:lastColumn="0" w:lastRow="0" w:noHBand="0" w:noVBand="1" w:val="04A0"/>
+      </w:tblPr>
+      <w:tblGrid>
+        <w:gridCol w:w="8640"/>
+      </w:tblGrid>
+      <w:tr>
+        <w:tc>
+          <w:tcPr>
+            <w:tcW w:type="dxa" w:w="8640"/>
+            <w:tcBorders>
+              <w:top w:val="single" w:sz="8" w:space="0" w:color="999999"/>
+              <w:left w:val="single" w:sz="8" w:space="0" w:color="999999"/>
+              <w:bottom w:val="single" w:sz="8" w:space="0" w:color="999999"/>
+              <w:right w:val="single" w:sz="8" w:space="0" w:color="999999"/>
+            </w:tcBorders>
+          </w:tcPr>
+          <w:p>
+            <w:pPr>
+              <w:spacing w:line="240" w:lineRule="auto" w:before="920" w:after="920"/>
+              <w:jc w:val="center"/>
+            </w:pPr>
+            <w:r>
+              <w:rPr>
+                <w:i/>
+                <w:color w:val="888888"/>
+                <w:sz w:val="20"/>
+              </w:rPr>
+              <w:t>[ Fig. 10 — paste figure here ]</w:t>
+            </w:r>
+          </w:p>
+        </w:tc>
+      </w:tr>
+    </w:tbl>
+    <w:p>
+      <w:pPr>
+        <w:spacing w:before="40" w:after="200" w:line="240" w:lineRule="auto"/>
+        <w:jc w:val="both"/>
+      </w:pPr>
+      <w:r>
+        <w:rPr>
+          <w:b/>
+          <w:i w:val="0"/>
+          <w:sz w:val="19"/>
+        </w:rPr>
+        <w:t xml:space="preserve">Fig. 10. </w:t>
+      </w:r>
+      <w:r>
+        <w:rPr>
+          <w:b w:val="0"/>
+          <w:i w:val="0"/>
+          <w:sz w:val="19"/>
+        </w:rPr>
+        <w:t xml:space="preserve">Global map of climate tipping elements and their estimated temperature thresholds. </w:t>
+      </w:r>
+      <w:r>
+        <w:rPr>
+          <w:b w:val="0"/>
+          <w:i/>
+          <w:sz w:val="19"/>
+        </w:rPr>
+        <w:t>Source: Armstrong McKay et al., Science, 2022, 377: eabn7950 [65] (copyright AAAS; access via publisher/institution).</w:t>
+      </w:r>
+      <w:r>
+        <w:rPr>
+          <w:b w:val="0"/>
+          <w:i w:val="0"/>
+          <w:sz w:val="19"/>
+        </w:rPr>
+        <w:t xml:space="preserve">  Download: https://www.science.org/doi/10.1126/science.abn7950</w:t>
       </w:r>
     </w:p>
     <w:p>

</xml_diff>